<commit_message>
feat: final project delivery - integrate all services, update UI, and documentation
</commit_message>
<xml_diff>
--- a/ml-worker-python/exports/CAM_APP-006.docx
+++ b/ml-worker-python/exports/CAM_APP-006.docx
@@ -54,7 +54,7 @@
     </w:p>
     <w:p>
       <w:r>
-        <w:t>Generated: 2026-03-17T16:00:45.537107+00:00</w:t>
+        <w:t>Generated: 2026-03-17T19:06:45.142966+00:00</w:t>
       </w:r>
     </w:p>
     <w:p>
@@ -72,7 +72,7 @@
     </w:p>
     <w:p>
       <w:r>
-        <w:t>Crimson Textiles Exports (Apparel &amp; Textiles) scored 57.4/100 by the hybrid risk engine. Deterministic policy direction: CONDITIONAL APPROVE ₹25L @ 15%.</w:t>
+        <w:t>Crimson Textiles Exports (Apparel &amp; Textiles) scored 0.0/100 by the hybrid risk engine. Deterministic policy direction: REJECT.</w:t>
       </w:r>
     </w:p>
     <w:p>
@@ -111,7 +111,7 @@
     </w:p>
     <w:p>
       <w:r>
-        <w:t>ICR 828.64x, EBITDA margin 4.8%, revenue growth -4.5%.</w:t>
+        <w:t>ICR 1.1x, EBITDA margin 4.8%, revenue growth -4.5%.</w:t>
       </w:r>
     </w:p>
     <w:p>
@@ -192,7 +192,7 @@
         <w:pStyle w:val="ListBullet"/>
       </w:pPr>
       <w:r>
-        <w:t>Direction: CONDITIONAL APPROVE ₹25L @ 15%</w:t>
+        <w:t>Direction: REJECT</w:t>
       </w:r>
     </w:p>
     <w:p>
@@ -200,7 +200,7 @@
         <w:pStyle w:val="ListBullet"/>
       </w:pPr>
       <w:r>
-        <w:t>Credit Limit: 25L</w:t>
+        <w:t>Credit Limit: —</w:t>
       </w:r>
     </w:p>
     <w:p>
@@ -208,7 +208,7 @@
         <w:pStyle w:val="ListBullet"/>
       </w:pPr>
       <w:r>
-        <w:t>Interest Rate: 15%</w:t>
+        <w:t>Interest Rate: —</w:t>
       </w:r>
     </w:p>
     <w:p>

</xml_diff>